<commit_message>
fix(round4): "Sport AnnaLytics"-Subtext vom Deckblatt entfernt
Anna 2026-05-18 (Screenshot-Feedback): unter "Leistungsdiagnostik Laufen"
soll kein zusätzliches Branding-Sublabel mehr stehen. Logo + Titel + Name +
Datum/Ort + kleine Kontaktzeile reichen — wirkt premium und ruhig.

Change:
- build_report_template.py: brand_p (Sport AnnaLytics, 13 pt Türkis) entfernt.
  Die zwei Leerabsätze zwischen Titel und Name bleiben.
- templates/report.docx: regeneriert.
- tests/e2e/test_reference_5pages.py: Cover-Assertion lockerer — nur noch
  "Leistungsdiagnostik" als Anker (Brand-Subtext nicht mehr Pflicht).

Render-QA: 5 Seiten halten (Rainier + Sarah, 83/83 Tests grün).

Co-Authored-By: Claude Opus 4.7 (1M context) <noreply@anthropic.com>
</commit_message>
<xml_diff>
--- a/templates/report.docx
+++ b/templates/report.docx
@@ -56,19 +56,6 @@
           <w:sz w:val="64"/>
         </w:rPr>
         <w:t>Leistungsdiagnostik {{ athlete.sportart_label }}</w:t>
-      </w:r>
-    </w:p>
-    <w:p>
-      <w:pPr>
-        <w:jc w:val="center"/>
-      </w:pPr>
-      <w:r>
-        <w:rPr>
-          <w:i w:val="0"/>
-          <w:color w:val="16C5A5"/>
-          <w:sz w:val="26"/>
-        </w:rPr>
-        <w:t>Sport AnnaLytics</w:t>
       </w:r>
     </w:p>
     <w:p/>

</xml_diff>